<commit_message>
chat et palette up
</commit_message>
<xml_diff>
--- a/PixelTogether.docx
+++ b/PixelTogether.docx
@@ -1514,21 +1514,7 @@
         <w:rPr>
           <w:highlight w:val="green"/>
         </w:rPr>
-        <w:t xml:space="preserve">Faire marcher la commande </w:t>
-      </w:r>
-      <w:proofErr w:type="gramStart"/>
-      <w:r>
-        <w:rPr>
-          <w:highlight w:val="green"/>
-        </w:rPr>
-        <w:t>socket.join</w:t>
-      </w:r>
-      <w:proofErr w:type="gramEnd"/>
-      <w:r>
-        <w:rPr>
-          <w:highlight w:val="green"/>
-        </w:rPr>
-        <w:t>(roomId) : séparer les joueurs dans des canaux différents.</w:t>
+        <w:t>Faire marcher la commande socket.join(roomId) : séparer les joueurs dans des canaux différents.</w:t>
       </w:r>
     </w:p>
     <w:p>
@@ -1934,21 +1920,7 @@
         <w:rPr>
           <w:highlight w:val="green"/>
         </w:rPr>
-        <w:t>Ajouter les couleurs aux pseudos dans le chat (</w:t>
-      </w:r>
-      <w:proofErr w:type="gramStart"/>
-      <w:r>
-        <w:rPr>
-          <w:highlight w:val="green"/>
-        </w:rPr>
-        <w:t>ex:</w:t>
-      </w:r>
-      <w:proofErr w:type="gramEnd"/>
-      <w:r>
-        <w:rPr>
-          <w:highlight w:val="green"/>
-        </w:rPr>
-        <w:t xml:space="preserve"> l'Owner en doré).</w:t>
+        <w:t>Ajouter les couleurs aux pseudos dans le chat (ex: l'Owner en doré).</w:t>
       </w:r>
     </w:p>
     <w:p>
@@ -2400,57 +2372,7 @@
         </w:numPr>
       </w:pPr>
       <w:r>
-        <w:t xml:space="preserve">Création </w:t>
-      </w:r>
-      <w:proofErr w:type="spellStart"/>
-      <w:r>
-        <w:t>grid</w:t>
-      </w:r>
-      <w:proofErr w:type="spellEnd"/>
-      <w:r>
-        <w:t xml:space="preserve"> =&gt;, </w:t>
-      </w:r>
-      <w:proofErr w:type="spellStart"/>
-      <w:r>
-        <w:rPr>
-          <w:b/>
-          <w:bCs/>
-        </w:rPr>
-        <w:t>is</w:t>
-      </w:r>
-      <w:proofErr w:type="spellEnd"/>
-      <w:r>
-        <w:rPr>
-          <w:b/>
-          <w:bCs/>
-        </w:rPr>
-        <w:t xml:space="preserve"> </w:t>
-      </w:r>
-      <w:proofErr w:type="spellStart"/>
-      <w:r>
-        <w:rPr>
-          <w:b/>
-          <w:bCs/>
-        </w:rPr>
-        <w:t>private</w:t>
-      </w:r>
-      <w:proofErr w:type="spellEnd"/>
-      <w:r>
-        <w:t xml:space="preserve"> = non </w:t>
-      </w:r>
-      <w:r>
-        <w:t xml:space="preserve">visibile dans </w:t>
-      </w:r>
-      <w:proofErr w:type="gramStart"/>
-      <w:r>
-        <w:t>les lobby</w:t>
-      </w:r>
-      <w:proofErr w:type="gramEnd"/>
-      <w:r>
-        <w:t xml:space="preserve"> </w:t>
-      </w:r>
-      <w:r>
-        <w:t>+ invitation de gens qui peuvent voir la grid et y participer</w:t>
+        <w:t xml:space="preserve">Ajout de la monnaie, 1 click = 1 gold. </w:t>
       </w:r>
     </w:p>
     <w:p>
@@ -2462,52 +2384,7 @@
         </w:numPr>
       </w:pPr>
       <w:r>
-        <w:t>3 state de grid :</w:t>
-      </w:r>
-    </w:p>
-    <w:p>
-      <w:pPr>
-        <w:pStyle w:val="Paragraphedeliste"/>
-        <w:numPr>
-          <w:ilvl w:val="1"/>
-          <w:numId w:val="22"/>
-        </w:numPr>
-      </w:pPr>
-      <w:r>
-        <w:t>Private, vu plus haut</w:t>
-      </w:r>
-      <w:r>
-        <w:t xml:space="preserve"> lobby ok pour gens invité avec effet GLOW sur la card</w:t>
-      </w:r>
-    </w:p>
-    <w:p>
-      <w:pPr>
-        <w:pStyle w:val="Paragraphedeliste"/>
-        <w:numPr>
-          <w:ilvl w:val="1"/>
-          <w:numId w:val="22"/>
-        </w:numPr>
-      </w:pPr>
-      <w:r>
-        <w:t>Public, limited. Tout le monde peut join mais posage de pixel uniquement par invitation</w:t>
-      </w:r>
-      <w:r>
-        <w:t xml:space="preserve"> lobby ok</w:t>
-      </w:r>
-    </w:p>
-    <w:p>
-      <w:pPr>
-        <w:pStyle w:val="Paragraphedeliste"/>
-        <w:numPr>
-          <w:ilvl w:val="1"/>
-          <w:numId w:val="22"/>
-        </w:numPr>
-      </w:pPr>
-      <w:r>
-        <w:t>Public, unlimited. Comme maintenant</w:t>
-      </w:r>
-      <w:r>
-        <w:t xml:space="preserve"> lobby ok</w:t>
+        <w:t xml:space="preserve">Boutique couleur </w:t>
       </w:r>
     </w:p>
     <w:p>
@@ -2519,117 +2396,7 @@
         </w:numPr>
       </w:pPr>
       <w:r>
-        <w:t xml:space="preserve">Ajout de la monnaie, 1 click = 1 gold. </w:t>
-      </w:r>
-    </w:p>
-    <w:p>
-      <w:pPr>
-        <w:pStyle w:val="Paragraphedeliste"/>
-        <w:numPr>
-          <w:ilvl w:val="0"/>
-          <w:numId w:val="22"/>
-        </w:numPr>
-      </w:pPr>
-      <w:r>
-        <w:t xml:space="preserve">Boutique couleur </w:t>
-      </w:r>
-    </w:p>
-    <w:p>
-      <w:pPr>
-        <w:pStyle w:val="Paragraphedeliste"/>
-        <w:numPr>
-          <w:ilvl w:val="0"/>
-          <w:numId w:val="22"/>
-        </w:numPr>
-      </w:pPr>
-      <w:r>
-        <w:t>Interface mes grilles, de base onGallerie = false, possibilité de choisir quoi mettre sur la gallerie. La gallerie affiche que les grid avec onGallry =true</w:t>
-      </w:r>
-    </w:p>
-    <w:p>
-      <w:pPr>
-        <w:pStyle w:val="Paragraphedeliste"/>
-        <w:numPr>
-          <w:ilvl w:val="0"/>
-          <w:numId w:val="22"/>
-        </w:numPr>
-      </w:pPr>
-      <w:proofErr w:type="gramStart"/>
-      <w:r>
-        <w:t>isFinished</w:t>
-      </w:r>
-      <w:proofErr w:type="gramEnd"/>
-      <w:r>
-        <w:t xml:space="preserve"> =&gt; fenetre avec arc en ciel GG toussa e</w:t>
-      </w:r>
-      <w:r>
-        <w:t xml:space="preserve">t au milieu l’image de la grid + text bravo vous avez fini votre grid, voulez vous l’afficher sur la gallerie ? onGallery toussa. Retrouvez </w:t>
-      </w:r>
-      <w:proofErr w:type="gramStart"/>
-      <w:r>
-        <w:t>la</w:t>
-      </w:r>
-      <w:proofErr w:type="gramEnd"/>
-      <w:r>
-        <w:t xml:space="preserve"> dans vos grille blabla</w:t>
-      </w:r>
-    </w:p>
-    <w:p>
-      <w:pPr>
-        <w:pStyle w:val="Paragraphedeliste"/>
-        <w:numPr>
-          <w:ilvl w:val="0"/>
-          <w:numId w:val="22"/>
-        </w:numPr>
-      </w:pPr>
-      <w:r>
-        <w:t xml:space="preserve">La </w:t>
-      </w:r>
-      <w:proofErr w:type="spellStart"/>
-      <w:r>
-        <w:t>gallery</w:t>
-      </w:r>
-      <w:proofErr w:type="spellEnd"/>
-      <w:r>
-        <w:t xml:space="preserve"> est limité à genre 50 grid, la 1ere affichée est la dernière</w:t>
-      </w:r>
-    </w:p>
-    <w:p>
-      <w:pPr>
-        <w:pStyle w:val="Paragraphedeliste"/>
-        <w:numPr>
-          <w:ilvl w:val="0"/>
-          <w:numId w:val="22"/>
-        </w:numPr>
-      </w:pPr>
-      <w:r>
         <w:t>Implémenter système de like, sauvegarder les likes</w:t>
-      </w:r>
-    </w:p>
-    <w:p>
-      <w:pPr>
-        <w:pStyle w:val="Paragraphedeliste"/>
-        <w:numPr>
-          <w:ilvl w:val="0"/>
-          <w:numId w:val="22"/>
-        </w:numPr>
-      </w:pPr>
-      <w:r>
-        <w:t xml:space="preserve">Nouvelle interface classement avec 4 </w:t>
-      </w:r>
-      <w:proofErr w:type="gramStart"/>
-      <w:r>
-        <w:t>onglet</w:t>
-      </w:r>
-      <w:proofErr w:type="gramEnd"/>
-      <w:r>
-        <w:t>, daily, hebdo, mensuel, annuel avec reset. Ceux avec plus de like = 1</w:t>
-      </w:r>
-      <w:r>
-        <w:rPr>
-          <w:vertAlign w:val="superscript"/>
-        </w:rPr>
-        <w:t>er</w:t>
       </w:r>
     </w:p>
     <w:p>
@@ -2666,659 +2433,19 @@
     <w:p/>
     <w:p/>
     <w:p/>
+    <w:p/>
+    <w:p/>
+    <w:p/>
+    <w:p/>
+    <w:p/>
+    <w:p/>
+    <w:p/>
+    <w:p/>
+    <w:p/>
+    <w:p/>
     <w:p>
       <w:r>
         <w:lastRenderedPageBreak/>
-        <w:t xml:space="preserve">Étape 8 — </w:t>
-      </w:r>
-      <w:r>
-        <w:rPr>
-          <w:rFonts w:ascii="Segoe UI Emoji" w:hAnsi="Segoe UI Emoji" w:cs="Segoe UI Emoji"/>
-        </w:rPr>
-        <w:t>⚙️</w:t>
-      </w:r>
-      <w:r>
-        <w:t xml:space="preserve"> Système de visibilité des </w:t>
-      </w:r>
-      <w:proofErr w:type="spellStart"/>
-      <w:r>
-        <w:t>grids</w:t>
-      </w:r>
-      <w:proofErr w:type="spellEnd"/>
-      <w:r>
-        <w:t xml:space="preserve"> (Private / Public Limited / Public </w:t>
-      </w:r>
-      <w:proofErr w:type="spellStart"/>
-      <w:r>
-        <w:t>Unlimited</w:t>
-      </w:r>
-      <w:proofErr w:type="spellEnd"/>
-      <w:r>
-        <w:t>)</w:t>
-      </w:r>
-    </w:p>
-    <w:p>
-      <w:r>
-        <w:rPr>
-          <w:b/>
-          <w:bCs/>
-        </w:rPr>
-        <w:t xml:space="preserve">Durée estimée : 4-5h | Difficulté : </w:t>
-      </w:r>
-      <w:r>
-        <w:rPr>
-          <w:rFonts w:ascii="Segoe UI Emoji" w:hAnsi="Segoe UI Emoji" w:cs="Segoe UI Emoji"/>
-          <w:b/>
-          <w:bCs/>
-        </w:rPr>
-        <w:t>⭐⭐⭐⭐</w:t>
-      </w:r>
-    </w:p>
-    <w:p>
-      <w:pPr>
-        <w:numPr>
-          <w:ilvl w:val="0"/>
-          <w:numId w:val="36"/>
-        </w:numPr>
-      </w:pPr>
-      <w:r>
-        <w:t> Ajouter au modèle </w:t>
-      </w:r>
-    </w:p>
-    <w:p>
-      <w:r>
-        <w:rPr>
-          <w:noProof/>
-        </w:rPr>
-        <mc:AlternateContent>
-          <mc:Choice Requires="wps">
-            <w:drawing>
-              <wp:inline distT="0" distB="0" distL="0" distR="0" wp14:anchorId="3830287F" wp14:editId="76BFFE2D">
-                <wp:extent cx="152400" cy="152400"/>
-                <wp:effectExtent l="0" t="0" r="0" b="0"/>
-                <wp:docPr id="383603242" name="Rectangle 15"/>
-                <wp:cNvGraphicFramePr>
-                  <a:graphicFrameLocks xmlns:a="http://schemas.openxmlformats.org/drawingml/2006/main" noChangeAspect="1"/>
-                </wp:cNvGraphicFramePr>
-                <a:graphic xmlns:a="http://schemas.openxmlformats.org/drawingml/2006/main">
-                  <a:graphicData uri="http://schemas.microsoft.com/office/word/2010/wordprocessingShape">
-                    <wps:wsp>
-                      <wps:cNvSpPr>
-                        <a:spLocks noChangeAspect="1" noChangeArrowheads="1"/>
-                      </wps:cNvSpPr>
-                      <wps:spPr bwMode="auto">
-                        <a:xfrm>
-                          <a:off x="0" y="0"/>
-                          <a:ext cx="152400" cy="152400"/>
-                        </a:xfrm>
-                        <a:prstGeom prst="rect">
-                          <a:avLst/>
-                        </a:prstGeom>
-                        <a:noFill/>
-                        <a:ln>
-                          <a:noFill/>
-                        </a:ln>
-                        <a:extLst>
-                          <a:ext uri="{909E8E84-426E-40DD-AFC4-6F175D3DCCD1}">
-                            <a14:hiddenFill xmlns:a14="http://schemas.microsoft.com/office/drawing/2010/main">
-                              <a:solidFill>
-                                <a:srgbClr val="FFFFFF"/>
-                              </a:solidFill>
-                            </a14:hiddenFill>
-                          </a:ext>
-                          <a:ext uri="{91240B29-F687-4F45-9708-019B960494DF}">
-                            <a14:hiddenLine xmlns:a14="http://schemas.microsoft.com/office/drawing/2010/main" w="9525">
-                              <a:solidFill>
-                                <a:srgbClr val="000000"/>
-                              </a:solidFill>
-                              <a:miter lim="800000"/>
-                              <a:headEnd/>
-                              <a:tailEnd/>
-                            </a14:hiddenLine>
-                          </a:ext>
-                        </a:extLst>
-                      </wps:spPr>
-                      <wps:bodyPr rot="0" vert="horz" wrap="square" lIns="91440" tIns="45720" rIns="91440" bIns="45720" anchor="t" anchorCtr="0" upright="1">
-                        <a:noAutofit/>
-                      </wps:bodyPr>
-                    </wps:wsp>
-                  </a:graphicData>
-                </a:graphic>
-              </wp:inline>
-            </w:drawing>
-          </mc:Choice>
-          <mc:Fallback>
-            <w:pict>
-              <v:rect w14:anchorId="7FE79E80" id="Rectangle 15" o:spid="_x0000_s1026" style="width:12pt;height:12pt;visibility:visible;mso-wrap-style:square;mso-left-percent:-10001;mso-top-percent:-10001;mso-position-horizontal:absolute;mso-position-horizontal-relative:char;mso-position-vertical:absolute;mso-position-vertical-relative:line;mso-left-percent:-10001;mso-top-percent:-10001;v-text-anchor:top" o:gfxdata="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" filled="f" stroked="f">
-                <o:lock v:ext="edit" aspectratio="t"/>
-                <w10:anchorlock/>
-              </v:rect>
-            </w:pict>
-          </mc:Fallback>
-        </mc:AlternateContent>
-      </w:r>
-    </w:p>
-    <w:p>
-      <w:pPr>
-        <w:rPr>
-          <w:lang w:val="en-US"/>
-        </w:rPr>
-      </w:pPr>
-      <w:r>
-        <w:rPr>
-          <w:lang w:val="en-US"/>
-        </w:rPr>
-        <w:t>Grid : visibility: 'private' | '</w:t>
-      </w:r>
-      <w:proofErr w:type="spellStart"/>
-      <w:r>
-        <w:rPr>
-          <w:lang w:val="en-US"/>
-        </w:rPr>
-        <w:t>public_limited</w:t>
-      </w:r>
-      <w:proofErr w:type="spellEnd"/>
-      <w:r>
-        <w:rPr>
-          <w:lang w:val="en-US"/>
-        </w:rPr>
-        <w:t>' | '</w:t>
-      </w:r>
-      <w:proofErr w:type="spellStart"/>
-      <w:r>
-        <w:rPr>
-          <w:lang w:val="en-US"/>
-        </w:rPr>
-        <w:t>public_unlimited</w:t>
-      </w:r>
-      <w:proofErr w:type="spellEnd"/>
-      <w:r>
-        <w:rPr>
-          <w:lang w:val="en-US"/>
-        </w:rPr>
-        <w:t>'</w:t>
-      </w:r>
-    </w:p>
-    <w:p>
-      <w:pPr>
-        <w:numPr>
-          <w:ilvl w:val="0"/>
-          <w:numId w:val="36"/>
-        </w:numPr>
-      </w:pPr>
-      <w:r>
-        <w:rPr>
-          <w:lang w:val="en-US"/>
-        </w:rPr>
-        <w:t> </w:t>
-      </w:r>
-      <w:r>
-        <w:t>Ajouter au modèle </w:t>
-      </w:r>
-      <w:proofErr w:type="spellStart"/>
-      <w:r>
-        <w:t>Grid</w:t>
-      </w:r>
-      <w:proofErr w:type="spellEnd"/>
-      <w:r>
-        <w:t> : </w:t>
-      </w:r>
-      <w:proofErr w:type="spellStart"/>
-      <w:proofErr w:type="gramStart"/>
-      <w:r>
-        <w:t>invitedUsers</w:t>
-      </w:r>
-      <w:proofErr w:type="spellEnd"/>
-      <w:r>
-        <w:t>:</w:t>
-      </w:r>
-      <w:proofErr w:type="gramEnd"/>
-      <w:r>
-        <w:t xml:space="preserve"> [</w:t>
-      </w:r>
-      <w:proofErr w:type="spellStart"/>
-      <w:r>
-        <w:t>ObjectId</w:t>
-      </w:r>
-      <w:proofErr w:type="spellEnd"/>
-      <w:r>
-        <w:t>] (liste des users invités)</w:t>
-      </w:r>
-    </w:p>
-    <w:p>
-      <w:pPr>
-        <w:numPr>
-          <w:ilvl w:val="0"/>
-          <w:numId w:val="36"/>
-        </w:numPr>
-      </w:pPr>
-      <w:r>
-        <w:t> </w:t>
-      </w:r>
-      <w:r>
-        <w:rPr>
-          <w:b/>
-          <w:bCs/>
-        </w:rPr>
-        <w:t>Private</w:t>
-      </w:r>
-      <w:r>
-        <w:t xml:space="preserve"> : invisible dans le lobby sauf pour les invités, effet GLOW sur la </w:t>
-      </w:r>
-      <w:proofErr w:type="spellStart"/>
-      <w:r>
-        <w:t>card</w:t>
-      </w:r>
-      <w:proofErr w:type="spellEnd"/>
-    </w:p>
-    <w:p>
-      <w:pPr>
-        <w:numPr>
-          <w:ilvl w:val="0"/>
-          <w:numId w:val="36"/>
-        </w:numPr>
-      </w:pPr>
-      <w:r>
-        <w:t> </w:t>
-      </w:r>
-      <w:r>
-        <w:rPr>
-          <w:b/>
-          <w:bCs/>
-        </w:rPr>
-        <w:t>Public Limited</w:t>
-      </w:r>
-      <w:r>
-        <w:t> : visible par tous, mais seuls les invités peuvent placer des pixels (les autres peuvent regarder)</w:t>
-      </w:r>
-    </w:p>
-    <w:p>
-      <w:pPr>
-        <w:numPr>
-          <w:ilvl w:val="0"/>
-          <w:numId w:val="36"/>
-        </w:numPr>
-      </w:pPr>
-      <w:r>
-        <w:t> </w:t>
-      </w:r>
-      <w:r>
-        <w:rPr>
-          <w:b/>
-          <w:bCs/>
-        </w:rPr>
-        <w:t xml:space="preserve">Public </w:t>
-      </w:r>
-      <w:proofErr w:type="spellStart"/>
-      <w:r>
-        <w:rPr>
-          <w:b/>
-          <w:bCs/>
-        </w:rPr>
-        <w:t>Unlimited</w:t>
-      </w:r>
-      <w:proofErr w:type="spellEnd"/>
-      <w:r>
-        <w:t> : comme maintenant, tout le monde peut dessiner</w:t>
-      </w:r>
-    </w:p>
-    <w:p>
-      <w:pPr>
-        <w:numPr>
-          <w:ilvl w:val="0"/>
-          <w:numId w:val="36"/>
-        </w:numPr>
-      </w:pPr>
-      <w:r>
-        <w:t> UI de création : choix du mode + champ d'invitation (pseudo ou lien)</w:t>
-      </w:r>
-    </w:p>
-    <w:p>
-      <w:pPr>
-        <w:numPr>
-          <w:ilvl w:val="0"/>
-          <w:numId w:val="36"/>
-        </w:numPr>
-      </w:pPr>
-      <w:r>
-        <w:t> Côté serveur : vérifier les permissions à chaque </w:t>
-      </w:r>
-      <w:proofErr w:type="spellStart"/>
-      <w:r>
-        <w:t>pixelPlaced</w:t>
-      </w:r>
-      <w:proofErr w:type="spellEnd"/>
-    </w:p>
-    <w:p>
-      <w:r>
-        <w:t>Le plus gros morceau de logique métier. Prends ton temps.</w:t>
-      </w:r>
-    </w:p>
-    <w:p>
-      <w:r>
-        <w:pict w14:anchorId="35EE9D33">
-          <v:rect id="_x0000_i1025" style="width:389.55pt;height:.75pt" o:hrpct="0" o:hralign="center" o:hrstd="t" o:hr="t" fillcolor="#a0a0a0" stroked="f"/>
-        </w:pict>
-      </w:r>
-    </w:p>
-    <w:p>
-      <w:r>
-        <w:t xml:space="preserve">Étape 9 — </w:t>
-      </w:r>
-      <w:r>
-        <w:rPr>
-          <w:rFonts w:ascii="Segoe UI Emoji" w:hAnsi="Segoe UI Emoji" w:cs="Segoe UI Emoji"/>
-        </w:rPr>
-        <w:t>🎨</w:t>
-      </w:r>
-      <w:r>
-        <w:t xml:space="preserve"> Écran de victoire (Finish avec arc-en-ciel </w:t>
-      </w:r>
-      <w:r>
-        <w:rPr>
-          <w:rFonts w:ascii="Segoe UI Emoji" w:hAnsi="Segoe UI Emoji" w:cs="Segoe UI Emoji"/>
-        </w:rPr>
-        <w:t>🌈</w:t>
-      </w:r>
-      <w:r>
-        <w:t>)</w:t>
-      </w:r>
-    </w:p>
-    <w:p>
-      <w:r>
-        <w:rPr>
-          <w:b/>
-          <w:bCs/>
-        </w:rPr>
-        <w:t xml:space="preserve">Durée estimée : 2-3h | Difficulté : </w:t>
-      </w:r>
-      <w:r>
-        <w:rPr>
-          <w:rFonts w:ascii="Segoe UI Emoji" w:hAnsi="Segoe UI Emoji" w:cs="Segoe UI Emoji"/>
-          <w:b/>
-          <w:bCs/>
-        </w:rPr>
-        <w:t>⭐⭐</w:t>
-      </w:r>
-    </w:p>
-    <w:p>
-      <w:pPr>
-        <w:numPr>
-          <w:ilvl w:val="0"/>
-          <w:numId w:val="37"/>
-        </w:numPr>
-      </w:pPr>
-      <w:r>
-        <w:t> Quand le host clique "Terminer" → écran de victoire animé (confettis, arc-en-ciel, GG)</w:t>
-      </w:r>
-    </w:p>
-    <w:p>
-      <w:pPr>
-        <w:numPr>
-          <w:ilvl w:val="0"/>
-          <w:numId w:val="37"/>
-        </w:numPr>
-      </w:pPr>
-      <w:r>
-        <w:t xml:space="preserve"> Au centre : l'image finale de la </w:t>
-      </w:r>
-      <w:proofErr w:type="spellStart"/>
-      <w:r>
-        <w:t>grid</w:t>
-      </w:r>
-      <w:proofErr w:type="spellEnd"/>
-    </w:p>
-    <w:p>
-      <w:pPr>
-        <w:numPr>
-          <w:ilvl w:val="0"/>
-          <w:numId w:val="37"/>
-        </w:numPr>
-      </w:pPr>
-      <w:r>
-        <w:t> Texte : "Bravo ! Votre grille est terminée !"</w:t>
-      </w:r>
-    </w:p>
-    <w:p>
-      <w:pPr>
-        <w:numPr>
-          <w:ilvl w:val="0"/>
-          <w:numId w:val="37"/>
-        </w:numPr>
-      </w:pPr>
-      <w:r>
-        <w:t> Bouton : "Afficher sur la galerie ?" → met </w:t>
-      </w:r>
-      <w:proofErr w:type="spellStart"/>
-      <w:proofErr w:type="gramStart"/>
-      <w:r>
-        <w:t>onGallery</w:t>
-      </w:r>
-      <w:proofErr w:type="spellEnd"/>
-      <w:r>
-        <w:t>:</w:t>
-      </w:r>
-      <w:proofErr w:type="gramEnd"/>
-      <w:r>
-        <w:t xml:space="preserve"> </w:t>
-      </w:r>
-      <w:proofErr w:type="spellStart"/>
-      <w:r>
-        <w:t>true</w:t>
-      </w:r>
-      <w:proofErr w:type="spellEnd"/>
-    </w:p>
-    <w:p>
-      <w:pPr>
-        <w:numPr>
-          <w:ilvl w:val="0"/>
-          <w:numId w:val="37"/>
-        </w:numPr>
-      </w:pPr>
-      <w:r>
-        <w:t> Bouton : "Garder privée" → met </w:t>
-      </w:r>
-      <w:proofErr w:type="spellStart"/>
-      <w:proofErr w:type="gramStart"/>
-      <w:r>
-        <w:t>onGallery</w:t>
-      </w:r>
-      <w:proofErr w:type="spellEnd"/>
-      <w:r>
-        <w:t>:</w:t>
-      </w:r>
-      <w:proofErr w:type="gramEnd"/>
-      <w:r>
-        <w:t xml:space="preserve"> false</w:t>
-      </w:r>
-    </w:p>
-    <w:p>
-      <w:pPr>
-        <w:numPr>
-          <w:ilvl w:val="0"/>
-          <w:numId w:val="37"/>
-        </w:numPr>
-      </w:pPr>
-      <w:r>
-        <w:t> Redirection vers "Mes grilles" après</w:t>
-      </w:r>
-    </w:p>
-    <w:p>
-      <w:r>
-        <w:t>Moment de satisfaction pour l'utilisateur, c'est le fun pur.</w:t>
-      </w:r>
-    </w:p>
-    <w:p>
-      <w:r>
-        <w:pict w14:anchorId="1E117264">
-          <v:rect id="_x0000_i1026" style="width:389.55pt;height:.75pt" o:hrpct="0" o:hralign="center" o:hrstd="t" o:hr="t" fillcolor="#a0a0a0" stroked="f"/>
-        </w:pict>
-      </w:r>
-    </w:p>
-    <w:p>
-      <w:r>
-        <w:t xml:space="preserve">Étape 10 — </w:t>
-      </w:r>
-      <w:r>
-        <w:rPr>
-          <w:rFonts w:ascii="Segoe UI Emoji" w:hAnsi="Segoe UI Emoji" w:cs="Segoe UI Emoji"/>
-        </w:rPr>
-        <w:t>⚙️</w:t>
-      </w:r>
-      <w:r>
-        <w:t xml:space="preserve"> Interface "Mes Grilles" + Galerie améliorée</w:t>
-      </w:r>
-    </w:p>
-    <w:p>
-      <w:r>
-        <w:rPr>
-          <w:b/>
-          <w:bCs/>
-        </w:rPr>
-        <w:t xml:space="preserve">Durée estimée : 3h | Difficulté : </w:t>
-      </w:r>
-      <w:r>
-        <w:rPr>
-          <w:rFonts w:ascii="Segoe UI Emoji" w:hAnsi="Segoe UI Emoji" w:cs="Segoe UI Emoji"/>
-          <w:b/>
-          <w:bCs/>
-        </w:rPr>
-        <w:t>⭐⭐⭐</w:t>
-      </w:r>
-    </w:p>
-    <w:p>
-      <w:pPr>
-        <w:numPr>
-          <w:ilvl w:val="0"/>
-          <w:numId w:val="38"/>
-        </w:numPr>
-      </w:pPr>
-      <w:r>
-        <w:lastRenderedPageBreak/>
-        <w:t> Ajouter </w:t>
-      </w:r>
-      <w:proofErr w:type="spellStart"/>
-      <w:proofErr w:type="gramStart"/>
-      <w:r>
-        <w:t>onGallery</w:t>
-      </w:r>
-      <w:proofErr w:type="spellEnd"/>
-      <w:r>
-        <w:t>:</w:t>
-      </w:r>
-      <w:proofErr w:type="gramEnd"/>
-      <w:r>
-        <w:t xml:space="preserve"> Boolean sur chaque </w:t>
-      </w:r>
-      <w:proofErr w:type="spellStart"/>
-      <w:r>
-        <w:t>grid</w:t>
-      </w:r>
-      <w:proofErr w:type="spellEnd"/>
-      <w:r>
-        <w:t xml:space="preserve"> sauvegardée du user</w:t>
-      </w:r>
-    </w:p>
-    <w:p>
-      <w:pPr>
-        <w:numPr>
-          <w:ilvl w:val="0"/>
-          <w:numId w:val="38"/>
-        </w:numPr>
-      </w:pPr>
-      <w:r>
-        <w:t xml:space="preserve"> Nouvelle page/modal "Mes grilles" : liste des grilles terminées avec </w:t>
-      </w:r>
-      <w:proofErr w:type="spellStart"/>
-      <w:r>
-        <w:t>toggle</w:t>
-      </w:r>
-      <w:proofErr w:type="spellEnd"/>
-      <w:r>
-        <w:t xml:space="preserve"> on/off galerie</w:t>
-      </w:r>
-    </w:p>
-    <w:p>
-      <w:pPr>
-        <w:numPr>
-          <w:ilvl w:val="0"/>
-          <w:numId w:val="38"/>
-        </w:numPr>
-      </w:pPr>
-      <w:r>
-        <w:t xml:space="preserve"> La galerie publique n'affiche que les </w:t>
-      </w:r>
-      <w:proofErr w:type="spellStart"/>
-      <w:r>
-        <w:t>grids</w:t>
-      </w:r>
-      <w:proofErr w:type="spellEnd"/>
-      <w:r>
-        <w:t xml:space="preserve"> avec </w:t>
-      </w:r>
-      <w:proofErr w:type="spellStart"/>
-      <w:proofErr w:type="gramStart"/>
-      <w:r>
-        <w:t>onGallery</w:t>
-      </w:r>
-      <w:proofErr w:type="spellEnd"/>
-      <w:r>
-        <w:t>:</w:t>
-      </w:r>
-      <w:proofErr w:type="gramEnd"/>
-      <w:r>
-        <w:t xml:space="preserve"> </w:t>
-      </w:r>
-      <w:proofErr w:type="spellStart"/>
-      <w:r>
-        <w:t>true</w:t>
-      </w:r>
-      <w:proofErr w:type="spellEnd"/>
-    </w:p>
-    <w:p>
-      <w:pPr>
-        <w:numPr>
-          <w:ilvl w:val="0"/>
-          <w:numId w:val="38"/>
-        </w:numPr>
-      </w:pPr>
-      <w:r>
-        <w:t> Limiter la galerie à 50 grilles, triées par date (les plus récentes en premier)</w:t>
-      </w:r>
-    </w:p>
-    <w:p>
-      <w:pPr>
-        <w:numPr>
-          <w:ilvl w:val="0"/>
-          <w:numId w:val="38"/>
-        </w:numPr>
-      </w:pPr>
-      <w:r>
-        <w:t xml:space="preserve"> Pagination ou </w:t>
-      </w:r>
-      <w:proofErr w:type="spellStart"/>
-      <w:r>
-        <w:t>infinite</w:t>
-      </w:r>
-      <w:proofErr w:type="spellEnd"/>
-      <w:r>
-        <w:t xml:space="preserve"> scroll</w:t>
-      </w:r>
-    </w:p>
-    <w:p>
-      <w:r>
-        <w:t>Mix front/back équilibré.</w:t>
-      </w:r>
-    </w:p>
-    <w:p>
-      <w:r>
-        <w:pict w14:anchorId="1E5E1709">
-          <v:rect id="_x0000_i1027" style="width:389.55pt;height:.75pt" o:hrpct="0" o:hralign="center" o:hrstd="t" o:hr="t" fillcolor="#a0a0a0" stroked="f"/>
-        </w:pict>
-      </w:r>
-    </w:p>
-    <w:p>
-      <w:r>
         <w:t xml:space="preserve">Étape 11 — </w:t>
       </w:r>
       <w:r>
@@ -3356,101 +2483,7 @@
         </w:numPr>
       </w:pPr>
       <w:r>
-        <w:t> Ajouter </w:t>
-      </w:r>
-      <w:proofErr w:type="gramStart"/>
-      <w:r>
-        <w:t>gold:</w:t>
-      </w:r>
-      <w:proofErr w:type="gramEnd"/>
-      <w:r>
-        <w:t xml:space="preserve"> Number au modèle </w:t>
-      </w:r>
-    </w:p>
-    <w:p>
-      <w:r>
-        <w:rPr>
-          <w:noProof/>
-        </w:rPr>
-        <mc:AlternateContent>
-          <mc:Choice Requires="wps">
-            <w:drawing>
-              <wp:inline distT="0" distB="0" distL="0" distR="0" wp14:anchorId="1AA66A4C" wp14:editId="67E23677">
-                <wp:extent cx="152400" cy="152400"/>
-                <wp:effectExtent l="0" t="0" r="0" b="0"/>
-                <wp:docPr id="1131982550" name="Rectangle 13"/>
-                <wp:cNvGraphicFramePr>
-                  <a:graphicFrameLocks xmlns:a="http://schemas.openxmlformats.org/drawingml/2006/main" noChangeAspect="1"/>
-                </wp:cNvGraphicFramePr>
-                <a:graphic xmlns:a="http://schemas.openxmlformats.org/drawingml/2006/main">
-                  <a:graphicData uri="http://schemas.microsoft.com/office/word/2010/wordprocessingShape">
-                    <wps:wsp>
-                      <wps:cNvSpPr>
-                        <a:spLocks noChangeAspect="1" noChangeArrowheads="1"/>
-                      </wps:cNvSpPr>
-                      <wps:spPr bwMode="auto">
-                        <a:xfrm>
-                          <a:off x="0" y="0"/>
-                          <a:ext cx="152400" cy="152400"/>
-                        </a:xfrm>
-                        <a:prstGeom prst="rect">
-                          <a:avLst/>
-                        </a:prstGeom>
-                        <a:noFill/>
-                        <a:ln>
-                          <a:noFill/>
-                        </a:ln>
-                        <a:extLst>
-                          <a:ext uri="{909E8E84-426E-40DD-AFC4-6F175D3DCCD1}">
-                            <a14:hiddenFill xmlns:a14="http://schemas.microsoft.com/office/drawing/2010/main">
-                              <a:solidFill>
-                                <a:srgbClr val="FFFFFF"/>
-                              </a:solidFill>
-                            </a14:hiddenFill>
-                          </a:ext>
-                          <a:ext uri="{91240B29-F687-4F45-9708-019B960494DF}">
-                            <a14:hiddenLine xmlns:a14="http://schemas.microsoft.com/office/drawing/2010/main" w="9525">
-                              <a:solidFill>
-                                <a:srgbClr val="000000"/>
-                              </a:solidFill>
-                              <a:miter lim="800000"/>
-                              <a:headEnd/>
-                              <a:tailEnd/>
-                            </a14:hiddenLine>
-                          </a:ext>
-                        </a:extLst>
-                      </wps:spPr>
-                      <wps:bodyPr rot="0" vert="horz" wrap="square" lIns="91440" tIns="45720" rIns="91440" bIns="45720" anchor="t" anchorCtr="0" upright="1">
-                        <a:noAutofit/>
-                      </wps:bodyPr>
-                    </wps:wsp>
-                  </a:graphicData>
-                </a:graphic>
-              </wp:inline>
-            </w:drawing>
-          </mc:Choice>
-          <mc:Fallback>
-            <w:pict>
-              <v:rect w14:anchorId="6192EBE2" id="Rectangle 13" o:spid="_x0000_s1026" style="width:12pt;height:12pt;visibility:visible;mso-wrap-style:square;mso-left-percent:-10001;mso-top-percent:-10001;mso-position-horizontal:absolute;mso-position-horizontal-relative:char;mso-position-vertical:absolute;mso-position-vertical-relative:line;mso-left-percent:-10001;mso-top-percent:-10001;v-text-anchor:top" o:gfxdata="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" filled="f" stroked="f">
-                <o:lock v:ext="edit" aspectratio="t"/>
-                <w10:anchorlock/>
-              </v:rect>
-            </w:pict>
-          </mc:Fallback>
-        </mc:AlternateContent>
-      </w:r>
-    </w:p>
-    <w:p>
-      <w:r>
-        <w:t>User (</w:t>
-      </w:r>
-      <w:proofErr w:type="gramStart"/>
-      <w:r>
-        <w:t>default:</w:t>
-      </w:r>
-      <w:proofErr w:type="gramEnd"/>
-      <w:r>
-        <w:t xml:space="preserve"> 0)</w:t>
+        <w:t> Ajouter gold: Number au modèle User (default: 0)</w:t>
       </w:r>
     </w:p>
     <w:p>
@@ -3472,21 +2505,8 @@
         </w:numPr>
       </w:pPr>
       <w:r>
-        <w:t xml:space="preserve"> Afficher le solde en temps réel dans la </w:t>
-      </w:r>
-      <w:proofErr w:type="spellStart"/>
-      <w:r>
-        <w:t>Navbar</w:t>
-      </w:r>
-      <w:proofErr w:type="spellEnd"/>
-      <w:r>
-        <w:t xml:space="preserve"> ou le </w:t>
-      </w:r>
-      <w:proofErr w:type="spellStart"/>
-      <w:r>
-        <w:t>GameUI</w:t>
-      </w:r>
-      <w:proofErr w:type="spellEnd"/>
+        <w:t> Afficher le solde en temps réel dans la Navbar ou le GameUI</w:t>
+      </w:r>
     </w:p>
     <w:p>
       <w:pPr>
@@ -3507,15 +2527,7 @@
         </w:numPr>
       </w:pPr>
       <w:r>
-        <w:t> Ajout des couleurs achetées au </w:t>
-      </w:r>
-      <w:proofErr w:type="spellStart"/>
-      <w:r>
-        <w:t>colors</w:t>
-      </w:r>
-      <w:proofErr w:type="spellEnd"/>
-      <w:r>
-        <w:t> du user</w:t>
+        <w:t> Ajout des couleurs achetées au colors du user</w:t>
       </w:r>
     </w:p>
     <w:p>
@@ -3526,15 +2538,7 @@
         </w:numPr>
       </w:pPr>
       <w:r>
-        <w:t xml:space="preserve"> UI de la boutique : </w:t>
-      </w:r>
-      <w:proofErr w:type="spellStart"/>
-      <w:r>
-        <w:t>cards</w:t>
-      </w:r>
-      <w:proofErr w:type="spellEnd"/>
-      <w:r>
-        <w:t xml:space="preserve"> de couleurs avec prix + bouton acheter</w:t>
+        <w:t> UI de la boutique : cards de couleurs avec prix + bouton acheter</w:t>
       </w:r>
     </w:p>
     <w:p>
@@ -3545,7 +2549,7 @@
     <w:p>
       <w:r>
         <w:pict w14:anchorId="7D4897A8">
-          <v:rect id="_x0000_i1028" style="width:389.55pt;height:.75pt" o:hrpct="0" o:hralign="center" o:hrstd="t" o:hr="t" fillcolor="#a0a0a0" stroked="f"/>
+          <v:rect id="_x0000_i1026" style="width:389.55pt;height:.75pt" o:hrpct="0" o:hralign="center" o:hrstd="t" o:hr="t" fillcolor="#a0a0a0" stroked="f"/>
         </w:pict>
       </w:r>
     </w:p>
@@ -3620,15 +2624,7 @@
         </w:numPr>
       </w:pPr>
       <w:r>
-        <w:t> </w:t>
-      </w:r>
-      <w:proofErr w:type="spellStart"/>
-      <w:r>
-        <w:t>Sanitizer</w:t>
-      </w:r>
-      <w:proofErr w:type="spellEnd"/>
-      <w:r>
-        <w:t xml:space="preserve"> les messages (échapper le HTML, limiter les caractères spéciaux)</w:t>
+        <w:t> Sanitizer les messages (échapper le HTML, limiter les caractères spéciaux)</w:t>
       </w:r>
     </w:p>
     <w:p>
@@ -3638,9 +2634,8 @@
     </w:p>
     <w:p>
       <w:r>
-        <w:lastRenderedPageBreak/>
         <w:pict w14:anchorId="64EF151F">
-          <v:rect id="_x0000_i1029" style="width:389.55pt;height:.75pt" o:hrpct="0" o:hralign="center" o:hrstd="t" o:hr="t" fillcolor="#a0a0a0" stroked="f"/>
+          <v:rect id="_x0000_i1027" style="width:389.55pt;height:.75pt" o:hrpct="0" o:hralign="center" o:hrstd="t" o:hr="t" fillcolor="#a0a0a0" stroked="f"/>
         </w:pict>
       </w:r>
     </w:p>
@@ -3658,25 +2653,7 @@
           <w:bCs/>
           <w:lang w:val="en-US"/>
         </w:rPr>
-        <w:t xml:space="preserve">Phase 3 — Features </w:t>
-      </w:r>
-      <w:proofErr w:type="spellStart"/>
-      <w:r>
-        <w:rPr>
-          <w:b/>
-          <w:bCs/>
-          <w:lang w:val="en-US"/>
-        </w:rPr>
-        <w:t>sociales</w:t>
-      </w:r>
-      <w:proofErr w:type="spellEnd"/>
-      <w:r>
-        <w:rPr>
-          <w:b/>
-          <w:bCs/>
-          <w:lang w:val="en-US"/>
-        </w:rPr>
-        <w:t xml:space="preserve"> (polish final)</w:t>
+        <w:t>Phase 3 — Features sociales (polish final)</w:t>
       </w:r>
     </w:p>
     <w:p>
@@ -3718,44 +2695,7 @@
         </w:numPr>
       </w:pPr>
       <w:r>
-        <w:t xml:space="preserve"> Ajouter au modèle </w:t>
-      </w:r>
-      <w:proofErr w:type="spellStart"/>
-      <w:r>
-        <w:t>Grid</w:t>
-      </w:r>
-      <w:proofErr w:type="spellEnd"/>
-      <w:r>
-        <w:t xml:space="preserve"> (ou un modèle séparé) : </w:t>
-      </w:r>
-      <w:proofErr w:type="gramStart"/>
-      <w:r>
-        <w:t>likes:</w:t>
-      </w:r>
-      <w:proofErr w:type="gramEnd"/>
-      <w:r>
-        <w:t xml:space="preserve"> </w:t>
-      </w:r>
-      <w:proofErr w:type="gramStart"/>
-      <w:r>
-        <w:t xml:space="preserve">[{ </w:t>
-      </w:r>
-      <w:proofErr w:type="spellStart"/>
-      <w:r>
-        <w:t>userId</w:t>
-      </w:r>
-      <w:proofErr w:type="spellEnd"/>
-      <w:proofErr w:type="gramEnd"/>
-      <w:r>
-        <w:t xml:space="preserve">, </w:t>
-      </w:r>
-      <w:proofErr w:type="gramStart"/>
-      <w:r>
-        <w:t>date }</w:t>
-      </w:r>
-      <w:proofErr w:type="gramEnd"/>
-      <w:r>
-        <w:t>]</w:t>
+        <w:t> Ajouter au modèle Grid (ou un modèle séparé) : likes: [{ userId, date }]</w:t>
       </w:r>
     </w:p>
     <w:p>
@@ -3766,13 +2706,8 @@
         </w:numPr>
       </w:pPr>
       <w:r>
-        <w:t xml:space="preserve"> Un user ne peut liker qu'une seule fois par </w:t>
-      </w:r>
-      <w:proofErr w:type="spellStart"/>
-      <w:r>
-        <w:t>grid</w:t>
-      </w:r>
-      <w:proofErr w:type="spellEnd"/>
+        <w:t> Un user ne peut liker qu'une seule fois par grid</w:t>
+      </w:r>
     </w:p>
     <w:p>
       <w:pPr>
@@ -3791,16 +2726,8 @@
         <w:rPr>
           <w:lang w:val="en-US"/>
         </w:rPr>
-        <w:t>API/Socket event pour liker/</w:t>
-      </w:r>
-      <w:proofErr w:type="spellStart"/>
-      <w:r>
-        <w:rPr>
-          <w:lang w:val="en-US"/>
-        </w:rPr>
-        <w:t>unliker</w:t>
-      </w:r>
-      <w:proofErr w:type="spellEnd"/>
+        <w:t>API/Socket event pour liker/unliker</w:t>
+      </w:r>
     </w:p>
     <w:p>
       <w:pPr>
@@ -3816,15 +2743,7 @@
         <w:t> </w:t>
       </w:r>
       <w:r>
-        <w:t xml:space="preserve">Afficher le nombre de likes sur chaque </w:t>
-      </w:r>
-      <w:proofErr w:type="spellStart"/>
-      <w:r>
-        <w:t>card</w:t>
-      </w:r>
-      <w:proofErr w:type="spellEnd"/>
-      <w:r>
-        <w:t xml:space="preserve"> de la galerie</w:t>
+        <w:t>Afficher le nombre de likes sur chaque card de la galerie</w:t>
       </w:r>
     </w:p>
     <w:p>
@@ -3841,94 +2760,13 @@
     <w:p>
       <w:r>
         <w:pict w14:anchorId="430A214D">
-          <v:rect id="_x0000_i1030" style="width:389.55pt;height:.75pt" o:hrpct="0" o:hralign="center" o:hrstd="t" o:hr="t" fillcolor="#a0a0a0" stroked="f"/>
+          <v:rect id="_x0000_i1028" style="width:389.55pt;height:.75pt" o:hrpct="0" o:hralign="center" o:hrstd="t" o:hr="t" fillcolor="#a0a0a0" stroked="f"/>
         </w:pict>
       </w:r>
     </w:p>
     <w:p>
       <w:r>
-        <w:t xml:space="preserve">Étape 14 — </w:t>
-      </w:r>
-      <w:r>
-        <w:rPr>
-          <w:rFonts w:ascii="Segoe UI Emoji" w:hAnsi="Segoe UI Emoji" w:cs="Segoe UI Emoji"/>
-        </w:rPr>
-        <w:t>🎨</w:t>
-      </w:r>
-      <w:r>
-        <w:t xml:space="preserve"> Classement</w:t>
-      </w:r>
-    </w:p>
-    <w:p>
-      <w:r>
-        <w:rPr>
-          <w:b/>
-          <w:bCs/>
-        </w:rPr>
-        <w:t xml:space="preserve">Durée estimée : 3h | Difficulté : </w:t>
-      </w:r>
-      <w:r>
-        <w:rPr>
-          <w:rFonts w:ascii="Segoe UI Emoji" w:hAnsi="Segoe UI Emoji" w:cs="Segoe UI Emoji"/>
-          <w:b/>
-          <w:bCs/>
-        </w:rPr>
-        <w:t>⭐⭐⭐</w:t>
-      </w:r>
-    </w:p>
-    <w:p>
-      <w:pPr>
-        <w:numPr>
-          <w:ilvl w:val="0"/>
-          <w:numId w:val="42"/>
-        </w:numPr>
-      </w:pPr>
-      <w:r>
-        <w:t> Nouvelle page/modal "Classement" avec 4 onglets : Jour / Semaine / Mois / Année</w:t>
-      </w:r>
-    </w:p>
-    <w:p>
-      <w:pPr>
-        <w:numPr>
-          <w:ilvl w:val="0"/>
-          <w:numId w:val="42"/>
-        </w:numPr>
-      </w:pPr>
-      <w:r>
-        <w:t> Classement basé sur les likes reçus dans la période</w:t>
-      </w:r>
-    </w:p>
-    <w:p>
-      <w:pPr>
-        <w:numPr>
-          <w:ilvl w:val="0"/>
-          <w:numId w:val="42"/>
-        </w:numPr>
-      </w:pPr>
-      <w:r>
-        <w:t> Top 10 avec pseudo, miniature, nombre de likes</w:t>
-      </w:r>
-    </w:p>
-    <w:p>
-      <w:pPr>
-        <w:numPr>
-          <w:ilvl w:val="0"/>
-          <w:numId w:val="42"/>
-        </w:numPr>
-      </w:pPr>
-      <w:r>
-        <w:t> Podium stylé pour les 3 premiers (médailles, tailles différentes)</w:t>
-      </w:r>
-    </w:p>
-    <w:p>
-      <w:r>
-        <w:pict w14:anchorId="76AC550C">
-          <v:rect id="_x0000_i1031" style="width:389.55pt;height:.75pt" o:hrpct="0" o:hralign="center" o:hrstd="t" o:hr="t" fillcolor="#a0a0a0" stroked="f"/>
-        </w:pict>
-      </w:r>
-    </w:p>
-    <w:p>
-      <w:r>
+        <w:lastRenderedPageBreak/>
         <w:t xml:space="preserve">Étape 15 — </w:t>
       </w:r>
       <w:r>
@@ -3966,15 +2804,7 @@
         </w:numPr>
       </w:pPr>
       <w:r>
-        <w:t xml:space="preserve"> Bouton "Signaler" sur les </w:t>
-      </w:r>
-      <w:proofErr w:type="spellStart"/>
-      <w:r>
-        <w:t>grids</w:t>
-      </w:r>
-      <w:proofErr w:type="spellEnd"/>
-      <w:r>
-        <w:t xml:space="preserve"> (en jeu + galerie)</w:t>
+        <w:t> Bouton "Signaler" sur les grids (en jeu + galerie)</w:t>
       </w:r>
     </w:p>
     <w:p>
@@ -3990,47 +2820,11 @@
       <w:r>
         <w:t> </w:t>
       </w:r>
-      <w:proofErr w:type="spellStart"/>
       <w:r>
         <w:rPr>
           <w:lang w:val="en-US"/>
         </w:rPr>
-        <w:t>Modèle</w:t>
-      </w:r>
-      <w:proofErr w:type="spellEnd"/>
-      <w:r>
-        <w:rPr>
-          <w:lang w:val="en-US"/>
-        </w:rPr>
-        <w:t xml:space="preserve"> Report : { </w:t>
-      </w:r>
-      <w:proofErr w:type="spellStart"/>
-      <w:r>
-        <w:rPr>
-          <w:lang w:val="en-US"/>
-        </w:rPr>
-        <w:t>gridId</w:t>
-      </w:r>
-      <w:proofErr w:type="spellEnd"/>
-      <w:r>
-        <w:rPr>
-          <w:lang w:val="en-US"/>
-        </w:rPr>
-        <w:t xml:space="preserve">, </w:t>
-      </w:r>
-      <w:proofErr w:type="spellStart"/>
-      <w:r>
-        <w:rPr>
-          <w:lang w:val="en-US"/>
-        </w:rPr>
-        <w:t>reporterId</w:t>
-      </w:r>
-      <w:proofErr w:type="spellEnd"/>
-      <w:r>
-        <w:rPr>
-          <w:lang w:val="en-US"/>
-        </w:rPr>
-        <w:t>, reason, date, status }</w:t>
+        <w:t>Modèle Report : { gridId, reporterId, reason, date, status }</w:t>
       </w:r>
     </w:p>
     <w:p>
@@ -4047,15 +2841,7 @@
         <w:t> </w:t>
       </w:r>
       <w:r>
-        <w:t>Rôle </w:t>
-      </w:r>
-      <w:proofErr w:type="spellStart"/>
-      <w:r>
-        <w:t>superAdmin</w:t>
-      </w:r>
-      <w:proofErr w:type="spellEnd"/>
-      <w:r>
-        <w:t> dans le modèle </w:t>
+        <w:t>Rôle superAdmin dans le modèle </w:t>
       </w:r>
     </w:p>
     <w:p>
@@ -4144,15 +2930,7 @@
         </w:numPr>
       </w:pPr>
       <w:r>
-        <w:t xml:space="preserve"> Panel admin : voir les reports, supprimer des </w:t>
-      </w:r>
-      <w:proofErr w:type="spellStart"/>
-      <w:r>
-        <w:t>grids</w:t>
-      </w:r>
-      <w:proofErr w:type="spellEnd"/>
-      <w:r>
-        <w:t>, bannir des joueurs</w:t>
+        <w:t> Panel admin : voir les reports, supprimer des grids, bannir des joueurs</w:t>
       </w:r>
     </w:p>
     <w:p>
@@ -4168,9 +2946,8 @@
     </w:p>
     <w:p>
       <w:r>
-        <w:lastRenderedPageBreak/>
         <w:pict w14:anchorId="70A72F6D">
-          <v:rect id="_x0000_i1032" style="width:389.55pt;height:.75pt" o:hrpct="0" o:hralign="center" o:hrstd="t" o:hr="t" fillcolor="#a0a0a0" stroked="f"/>
+          <v:rect id="_x0000_i1030" style="width:389.55pt;height:.75pt" o:hrpct="0" o:hralign="center" o:hrstd="t" o:hr="t" fillcolor="#a0a0a0" stroked="f"/>
         </w:pict>
       </w:r>
     </w:p>
@@ -4196,15 +2973,7 @@
         </w:numPr>
       </w:pPr>
       <w:r>
-        <w:t xml:space="preserve">Page de landing, accorder possibilité d’aller sur le lobby et rejoindre une partie, socket.ID = </w:t>
-      </w:r>
-      <w:proofErr w:type="spellStart"/>
-      <w:r>
-        <w:t>guest</w:t>
-      </w:r>
-      <w:proofErr w:type="spellEnd"/>
-      <w:r>
-        <w:t xml:space="preserve"> =&gt; ne peut pas poser de pixel, ni chat, juste regarder les room en live</w:t>
+        <w:t>Page de landing, accorder possibilité d’aller sur le lobby et rejoindre une partie, socket.ID = guest =&gt; ne peut pas poser de pixel, ni chat, juste regarder les room en live</w:t>
       </w:r>
     </w:p>
     <w:p>
@@ -4216,39 +2985,7 @@
         </w:numPr>
       </w:pPr>
       <w:r>
-        <w:t xml:space="preserve">PNG =&gt; </w:t>
-      </w:r>
-      <w:proofErr w:type="spellStart"/>
-      <w:r>
-        <w:t>WebP</w:t>
-      </w:r>
-      <w:proofErr w:type="spellEnd"/>
-      <w:r>
-        <w:t xml:space="preserve"> (</w:t>
-      </w:r>
-      <w:proofErr w:type="spellStart"/>
-      <w:r>
-        <w:t>canvas</w:t>
-      </w:r>
-      <w:proofErr w:type="spellEnd"/>
-      <w:r>
-        <w:t xml:space="preserve"> ne </w:t>
-      </w:r>
-      <w:proofErr w:type="spellStart"/>
-      <w:r>
-        <w:t>gere</w:t>
-      </w:r>
-      <w:proofErr w:type="spellEnd"/>
-      <w:r>
-        <w:t xml:space="preserve"> pas </w:t>
-      </w:r>
-      <w:proofErr w:type="spellStart"/>
-      <w:r>
-        <w:t>WebP</w:t>
-      </w:r>
-      <w:proofErr w:type="spellEnd"/>
-      <w:r>
-        <w:t>)</w:t>
+        <w:t>PNG =&gt; WebP (canvas ne gere pas WebP)</w:t>
       </w:r>
     </w:p>
     <w:p>
@@ -4275,15 +3012,7 @@
         </w:numPr>
       </w:pPr>
       <w:r>
-        <w:t xml:space="preserve">Palette </w:t>
-      </w:r>
-      <w:proofErr w:type="spellStart"/>
-      <w:r>
-        <w:t>decalée</w:t>
-      </w:r>
-      <w:proofErr w:type="spellEnd"/>
-      <w:r>
-        <w:t xml:space="preserve"> sur mobile, enlever « spawn » fixe</w:t>
+        <w:t>Palette decalée sur mobile, enlever « spawn » fixe</w:t>
       </w:r>
     </w:p>
     <w:p>
@@ -4295,15 +3024,7 @@
         </w:numPr>
       </w:pPr>
       <w:r>
-        <w:t xml:space="preserve">Chat qui </w:t>
-      </w:r>
-      <w:proofErr w:type="spellStart"/>
-      <w:r>
-        <w:t>defile</w:t>
-      </w:r>
-      <w:proofErr w:type="spellEnd"/>
-      <w:r>
-        <w:t xml:space="preserve"> automatiquement</w:t>
+        <w:t>Chat qui defile automatiquement</w:t>
       </w:r>
     </w:p>
     <w:p>
@@ -4327,50 +3048,10 @@
         </w:numPr>
       </w:pPr>
       <w:r>
-        <w:t xml:space="preserve">Validation sur </w:t>
-      </w:r>
-      <w:proofErr w:type="spellStart"/>
-      <w:r>
-        <w:t>closeRoom</w:t>
-      </w:r>
-      <w:proofErr w:type="spellEnd"/>
-      <w:r>
-        <w:t xml:space="preserve"> </w:t>
-      </w:r>
-      <w:proofErr w:type="spellStart"/>
-      <w:r>
-        <w:t>deleteCanvas</w:t>
-      </w:r>
-      <w:proofErr w:type="spellEnd"/>
-      <w:r>
-        <w:t xml:space="preserve"> </w:t>
-      </w:r>
-      <w:proofErr w:type="spellStart"/>
-      <w:r>
-        <w:t>finishCanvas</w:t>
-      </w:r>
-      <w:proofErr w:type="spellEnd"/>
-      <w:r>
-        <w:t xml:space="preserve"> et </w:t>
-      </w:r>
-      <w:proofErr w:type="spellStart"/>
-      <w:r>
-        <w:t>exitGame</w:t>
-      </w:r>
-      <w:proofErr w:type="spellEnd"/>
-      <w:r>
-        <w:t xml:space="preserve"> =&gt; </w:t>
-      </w:r>
-      <w:r>
-        <w:t xml:space="preserve">check </w:t>
-      </w:r>
-      <w:proofErr w:type="spellStart"/>
-      <w:r>
-        <w:t>l’id</w:t>
-      </w:r>
-      <w:proofErr w:type="spellEnd"/>
-      <w:r>
-        <w:t xml:space="preserve"> de l’host, sinon n importe qui peut fermer la room</w:t>
+        <w:t xml:space="preserve">Validation sur closeRoom deleteCanvas finishCanvas et exitGame =&gt; </w:t>
+      </w:r>
+      <w:r>
+        <w:t>check l’id de l’host, sinon n importe qui peut fermer la room</w:t>
       </w:r>
     </w:p>
     <w:p>
@@ -4382,21 +3063,8 @@
         </w:numPr>
       </w:pPr>
       <w:r>
-        <w:t xml:space="preserve">Connection à </w:t>
-      </w:r>
-      <w:proofErr w:type="gramStart"/>
-      <w:r>
-        <w:t>plusieurs endroit</w:t>
-      </w:r>
-      <w:proofErr w:type="gramEnd"/>
-      <w:r>
-        <w:t xml:space="preserve">, double host dans même </w:t>
-      </w:r>
-      <w:proofErr w:type="spellStart"/>
-      <w:r>
-        <w:t>grid</w:t>
-      </w:r>
-      <w:proofErr w:type="spellEnd"/>
+        <w:t>Connection à plusieurs endroit, double host dans même grid</w:t>
+      </w:r>
     </w:p>
     <w:p>
       <w:pPr>
@@ -4418,6 +3086,54 @@
           <w:numId w:val="22"/>
         </w:numPr>
       </w:pPr>
+      <w:r>
+        <w:t>Dans Ma gallerie, bouton poubelle en bas a droite rouge avec disclaimer pour supprimer de la BDD</w:t>
+      </w:r>
+      <w:r>
+        <w:t>. DONE mais rajouter disclaimer</w:t>
+      </w:r>
+    </w:p>
+    <w:p>
+      <w:pPr>
+        <w:pStyle w:val="Paragraphedeliste"/>
+        <w:numPr>
+          <w:ilvl w:val="0"/>
+          <w:numId w:val="22"/>
+        </w:numPr>
+      </w:pPr>
+      <w:r>
+        <w:t>Dans gallery public, ajouté sur la card il x heures / jours / semaines selon timestamp</w:t>
+      </w:r>
+    </w:p>
+    <w:p>
+      <w:pPr>
+        <w:pStyle w:val="Paragraphedeliste"/>
+        <w:numPr>
+          <w:ilvl w:val="0"/>
+          <w:numId w:val="22"/>
+        </w:numPr>
+      </w:pPr>
+      <w:r>
+        <w:t>Nouvelle interface classement avec 4 onglet, daily, hebdo, mensuel, annuel avec reset. Ceux avec plus de like = 1</w:t>
+      </w:r>
+      <w:r>
+        <w:rPr>
+          <w:vertAlign w:val="superscript"/>
+        </w:rPr>
+        <w:t>er</w:t>
+      </w:r>
+    </w:p>
+    <w:p>
+      <w:pPr>
+        <w:pStyle w:val="Paragraphedeliste"/>
+        <w:numPr>
+          <w:ilvl w:val="0"/>
+          <w:numId w:val="22"/>
+        </w:numPr>
+      </w:pPr>
+      <w:r>
+        <w:t>Empecher d’acheter 2x la même couleure</w:t>
+      </w:r>
     </w:p>
     <w:sectPr>
       <w:headerReference w:type="even" r:id="rId12"/>
@@ -12031,6 +10747,7 @@
     <w:rsid w:val="001946BF"/>
     <w:rsid w:val="002201A4"/>
     <w:rsid w:val="00225D2C"/>
+    <w:rsid w:val="00252718"/>
     <w:rsid w:val="002C593A"/>
     <w:rsid w:val="002C5A7C"/>
     <w:rsid w:val="002C5C81"/>
@@ -12038,17 +10755,22 @@
     <w:rsid w:val="00305191"/>
     <w:rsid w:val="00385413"/>
     <w:rsid w:val="003973D7"/>
+    <w:rsid w:val="003A4B1A"/>
     <w:rsid w:val="003D6B2B"/>
     <w:rsid w:val="005335C0"/>
     <w:rsid w:val="005E78DA"/>
+    <w:rsid w:val="00620015"/>
     <w:rsid w:val="0067199A"/>
     <w:rsid w:val="007C4390"/>
     <w:rsid w:val="007C690D"/>
     <w:rsid w:val="008009AE"/>
     <w:rsid w:val="00851961"/>
+    <w:rsid w:val="0086010E"/>
+    <w:rsid w:val="008642B5"/>
     <w:rsid w:val="0087190E"/>
     <w:rsid w:val="00932D02"/>
     <w:rsid w:val="009C1D87"/>
+    <w:rsid w:val="009F59EF"/>
     <w:rsid w:val="00A156BE"/>
     <w:rsid w:val="00B1340F"/>
     <w:rsid w:val="00B26F05"/>

</xml_diff>